<commit_message>
last review for work app on cloud
</commit_message>
<xml_diff>
--- a/Plan_prévisionnel_P07_POC.docx
+++ b/Plan_prévisionnel_P07_POC.docx
@@ -633,6 +633,7 @@
           <w:rFonts w:ascii="Inter" w:eastAsia="Inter" w:hAnsi="Inter" w:cs="Inter"/>
           <w:b/>
           <w:bCs/>
+          <w:color w:val="FF0000"/>
           <w:sz w:val="28"/>
           <w:szCs w:val="28"/>
           <w:u w:val="single"/>
@@ -651,63 +652,78 @@
         </w:rPr>
         <w:t>Blog pédagogique de référence</w:t>
       </w:r>
-    </w:p>
-    <w:p>
-      <w:pPr>
-        <w:pStyle w:val="Titre2"/>
-        <w:rPr>
-          <w:rFonts w:ascii="Inter" w:eastAsia="Inter" w:hAnsi="Inter" w:cs="Inter"/>
-          <w:b/>
-          <w:sz w:val="24"/>
-          <w:szCs w:val="24"/>
-          <w:lang w:val="fr-FR"/>
-        </w:rPr>
-      </w:pPr>
-      <w:r>
-        <w:rPr>
-          <w:rFonts w:ascii="Inter" w:eastAsia="Inter" w:hAnsi="Inter" w:cs="Inter"/>
-          <w:b/>
-          <w:bCs/>
-          <w:sz w:val="24"/>
-          <w:szCs w:val="24"/>
-          <w:lang w:val="fr-FR"/>
-        </w:rPr>
-        <w:t>"</w:t>
-      </w:r>
-      <w:proofErr w:type="gramStart"/>
-      <w:r>
-        <w:rPr>
-          <w:rFonts w:ascii="Inter" w:eastAsia="Inter" w:hAnsi="Inter" w:cs="Inter"/>
-          <w:b/>
-          <w:bCs/>
-          <w:sz w:val="24"/>
-          <w:szCs w:val="24"/>
-          <w:lang w:val="fr-FR"/>
-        </w:rPr>
-        <w:t>ConvNeXt:</w:t>
-      </w:r>
-      <w:proofErr w:type="gramEnd"/>
-      <w:r>
-        <w:rPr>
-          <w:rFonts w:ascii="Inter" w:eastAsia="Inter" w:hAnsi="Inter" w:cs="Inter"/>
-          <w:b/>
-          <w:bCs/>
-          <w:sz w:val="24"/>
-          <w:szCs w:val="24"/>
-          <w:lang w:val="fr-FR"/>
-        </w:rPr>
-        <w:t xml:space="preserve"> The Return of Convolutional Networks"</w:t>
-      </w:r>
-      <w:r>
-        <w:rPr>
-          <w:rFonts w:ascii="Inter" w:eastAsia="Inter" w:hAnsi="Inter" w:cs="Inter"/>
-          <w:b/>
-          <w:sz w:val="24"/>
-          <w:szCs w:val="24"/>
-          <w:lang w:val="fr-FR"/>
-        </w:rPr>
-        <w:t xml:space="preserve"> par Towards Data Science</w:t>
-      </w:r>
+      <w:r>
+        <w:rPr>
+          <w:rFonts w:ascii="Inter" w:eastAsia="Inter" w:hAnsi="Inter" w:cs="Inter"/>
+          <w:b/>
+          <w:bCs/>
+          <w:sz w:val="28"/>
+          <w:szCs w:val="28"/>
+          <w:u w:val="single"/>
+          <w:lang w:val="fr-FR"/>
+        </w:rPr>
+        <w:t xml:space="preserve"> – </w:t>
+      </w:r>
+      <w:r>
+        <w:rPr>
+          <w:rFonts w:ascii="Inter" w:eastAsia="Inter" w:hAnsi="Inter" w:cs="Inter"/>
+          <w:b/>
+          <w:bCs/>
+          <w:color w:val="FF0000"/>
+          <w:sz w:val="28"/>
+          <w:szCs w:val="28"/>
+          <w:u w:val="single"/>
+          <w:lang w:val="fr-FR"/>
+        </w:rPr>
+        <w:t>MODIFICATION du lien</w:t>
+      </w:r>
+    </w:p>
+    <w:p>
+      <w:pPr>
+        <w:pStyle w:val="Titre1"/>
+        <w:shd w:val="clear" w:color="auto" w:fill="FFFFFF"/>
+        <w:rPr>
+          <w:rFonts w:ascii="Inter" w:hAnsi="Inter"/>
+          <w:color w:val="2A2A2A"/>
+          <w:sz w:val="28"/>
+          <w:szCs w:val="28"/>
+          <w:lang w:val="en-US"/>
+        </w:rPr>
+      </w:pPr>
+      <w:proofErr w:type="spellStart"/>
+      <w:r>
+        <w:rPr>
+          <w:rFonts w:ascii="Inter" w:hAnsi="Inter"/>
+          <w:color w:val="2A2A2A"/>
+          <w:sz w:val="28"/>
+          <w:szCs w:val="28"/>
+          <w:lang w:val="en-US"/>
+        </w:rPr>
+        <w:t>ConvNeXt</w:t>
+      </w:r>
+      <w:proofErr w:type="spellEnd"/>
+      <w:r>
+        <w:rPr>
+          <w:rFonts w:ascii="Inter" w:hAnsi="Inter"/>
+          <w:color w:val="2A2A2A"/>
+          <w:sz w:val="28"/>
+          <w:szCs w:val="28"/>
+          <w:lang w:val="en-US"/>
+        </w:rPr>
+        <w:t xml:space="preserve"> Paper Walkthrough: The CNN That Challenges </w:t>
+      </w:r>
+      <w:proofErr w:type="spellStart"/>
+      <w:r>
+        <w:rPr>
+          <w:rFonts w:ascii="Inter" w:hAnsi="Inter"/>
+          <w:color w:val="2A2A2A"/>
+          <w:sz w:val="28"/>
+          <w:szCs w:val="28"/>
+          <w:lang w:val="en-US"/>
+        </w:rPr>
+        <w:t>ViT</w:t>
+      </w:r>
+      <w:proofErr w:type="spellEnd"/>
     </w:p>
     <w:p>
       <w:pPr>
@@ -721,10 +737,192 @@
           <w:b/>
           <w:sz w:val="24"/>
           <w:szCs w:val="24"/>
-          <w:lang w:val="fr-FR"/>
+          <w:lang w:val="en-US"/>
         </w:rPr>
       </w:pPr>
       <w:hyperlink r:id="rId10" w:history="1">
+        <w:r>
+          <w:rPr>
+            <w:rStyle w:val="Lienhypertexte"/>
+            <w:lang w:val="en-US"/>
+          </w:rPr>
+          <w:t>https://towardsdatascience.com/the-cnn-that-challenges-vit/</w:t>
+        </w:r>
+      </w:hyperlink>
+    </w:p>
+    <w:p>
+      <w:pPr>
+        <w:pStyle w:val="Titre2"/>
+        <w:numPr>
+          <w:ilvl w:val="0"/>
+          <w:numId w:val="5"/>
+        </w:numPr>
+        <w:rPr>
+          <w:rFonts w:ascii="Inter" w:eastAsia="Inter" w:hAnsi="Inter" w:cs="Inter"/>
+          <w:b/>
+          <w:sz w:val="24"/>
+          <w:szCs w:val="24"/>
+          <w:lang w:val="fr-FR"/>
+        </w:rPr>
+      </w:pPr>
+      <w:r>
+        <w:rPr>
+          <w:rFonts w:ascii="Inter" w:eastAsia="Inter" w:hAnsi="Inter" w:cs="Inter"/>
+          <w:b/>
+          <w:sz w:val="24"/>
+          <w:szCs w:val="24"/>
+          <w:lang w:val="fr-FR"/>
+        </w:rPr>
+        <w:lastRenderedPageBreak/>
+        <w:t>Explique la modernisation progressive des CNN (7 étapes de transformation de ResNet vers ConvNeXt)</w:t>
+      </w:r>
+    </w:p>
+    <w:p>
+      <w:pPr>
+        <w:pStyle w:val="Titre2"/>
+        <w:numPr>
+          <w:ilvl w:val="0"/>
+          <w:numId w:val="5"/>
+        </w:numPr>
+        <w:rPr>
+          <w:rFonts w:ascii="Inter" w:eastAsia="Inter" w:hAnsi="Inter" w:cs="Inter"/>
+          <w:b/>
+          <w:sz w:val="24"/>
+          <w:szCs w:val="24"/>
+          <w:lang w:val="fr-FR"/>
+        </w:rPr>
+      </w:pPr>
+      <w:r>
+        <w:rPr>
+          <w:rFonts w:ascii="Inter" w:eastAsia="Inter" w:hAnsi="Inter" w:cs="Inter"/>
+          <w:b/>
+          <w:sz w:val="24"/>
+          <w:szCs w:val="24"/>
+          <w:lang w:val="fr-FR"/>
+        </w:rPr>
+        <w:t>Permet de comprendre comment ConvNeXt intègre les principes des Transformers dans une architecture convolutionnelle</w:t>
+      </w:r>
+    </w:p>
+    <w:p>
+      <w:pPr>
+        <w:pStyle w:val="Titre2"/>
+        <w:rPr>
+          <w:rFonts w:ascii="Inter" w:eastAsia="Inter" w:hAnsi="Inter" w:cs="Inter"/>
+          <w:b/>
+          <w:bCs/>
+          <w:sz w:val="28"/>
+          <w:szCs w:val="28"/>
+          <w:u w:val="single"/>
+          <w:lang w:val="fr-FR"/>
+        </w:rPr>
+      </w:pPr>
+      <w:r>
+        <w:rPr>
+          <w:rFonts w:ascii="Inter" w:eastAsia="Inter" w:hAnsi="Inter" w:cs="Inter"/>
+          <w:b/>
+          <w:bCs/>
+          <w:sz w:val="28"/>
+          <w:szCs w:val="28"/>
+          <w:u w:val="single"/>
+          <w:lang w:val="fr-FR"/>
+        </w:rPr>
+        <w:t>Média reconnu en data science</w:t>
+      </w:r>
+    </w:p>
+    <w:p>
+      <w:pPr>
+        <w:pStyle w:val="Titre2"/>
+        <w:rPr>
+          <w:rFonts w:ascii="Inter" w:eastAsia="Inter" w:hAnsi="Inter" w:cs="Inter"/>
+          <w:b/>
+          <w:sz w:val="24"/>
+          <w:szCs w:val="24"/>
+          <w:lang w:val="en-US"/>
+        </w:rPr>
+      </w:pPr>
+      <w:proofErr w:type="spellStart"/>
+      <w:r>
+        <w:rPr>
+          <w:rFonts w:ascii="Inter" w:eastAsia="Inter" w:hAnsi="Inter" w:cs="Inter"/>
+          <w:b/>
+          <w:bCs/>
+          <w:sz w:val="24"/>
+          <w:szCs w:val="24"/>
+          <w:lang w:val="en-US"/>
+        </w:rPr>
+        <w:t>KDnuggets</w:t>
+      </w:r>
+      <w:proofErr w:type="spellEnd"/>
+      <w:r>
+        <w:rPr>
+          <w:rFonts w:ascii="Inter" w:eastAsia="Inter" w:hAnsi="Inter" w:cs="Inter"/>
+          <w:b/>
+          <w:bCs/>
+          <w:sz w:val="24"/>
+          <w:szCs w:val="24"/>
+          <w:lang w:val="en-US"/>
+        </w:rPr>
+        <w:t xml:space="preserve"> - </w:t>
+      </w:r>
+      <w:r>
+        <w:rPr>
+          <w:rFonts w:ascii="Inter" w:eastAsia="Inter" w:hAnsi="Inter" w:cs="Inter"/>
+          <w:b/>
+          <w:bCs/>
+          <w:sz w:val="24"/>
+          <w:szCs w:val="24"/>
+          <w:lang w:val="en-US"/>
+        </w:rPr>
+        <w:t>What Are Foundation Models and How Do They Work?</w:t>
+      </w:r>
+      <w:r>
+        <w:rPr>
+          <w:rFonts w:ascii="Inter" w:eastAsia="Inter" w:hAnsi="Inter" w:cs="Inter"/>
+          <w:b/>
+          <w:bCs/>
+          <w:sz w:val="24"/>
+          <w:szCs w:val="24"/>
+          <w:lang w:val="en-US"/>
+        </w:rPr>
+        <w:t xml:space="preserve"> </w:t>
+      </w:r>
+      <w:r>
+        <w:rPr>
+          <w:rFonts w:ascii="Inter" w:eastAsia="Inter" w:hAnsi="Inter" w:cs="Inter"/>
+          <w:b/>
+          <w:bCs/>
+          <w:sz w:val="24"/>
+          <w:szCs w:val="24"/>
+          <w:lang w:val="en-US"/>
+        </w:rPr>
+        <w:t xml:space="preserve">- </w:t>
+      </w:r>
+    </w:p>
+    <w:p>
+      <w:pPr>
+        <w:pStyle w:val="Titre2"/>
+        <w:numPr>
+          <w:ilvl w:val="0"/>
+          <w:numId w:val="6"/>
+        </w:numPr>
+        <w:rPr>
+          <w:rFonts w:ascii="Inter" w:eastAsia="Inter" w:hAnsi="Inter" w:cs="Inter"/>
+          <w:b/>
+          <w:sz w:val="24"/>
+          <w:szCs w:val="24"/>
+          <w:lang w:val="en-US"/>
+        </w:rPr>
+      </w:pPr>
+      <w:hyperlink r:id="rId11" w:history="1">
+        <w:r>
+          <w:rPr>
+            <w:rStyle w:val="Lienhypertexte"/>
+            <w:sz w:val="22"/>
+            <w:szCs w:val="22"/>
+            <w:lang w:val="en-US"/>
+          </w:rPr>
+          <w:t xml:space="preserve"> </w:t>
+        </w:r>
         <w:r>
           <w:rPr>
             <w:rStyle w:val="Lienhypertexte"/>
@@ -732,130 +930,10 @@
             <w:b/>
             <w:sz w:val="24"/>
             <w:szCs w:val="24"/>
-            <w:lang w:val="fr-FR"/>
+            <w:lang w:val="en-US"/>
           </w:rPr>
-          <w:t>https://towardsdatascience.com/convnext-the-return-of-convolution-networks-d4c9789b4d58</w:t>
+          <w:t>https://www.kdnuggets.com/2023/05/foundation-models-work.html</w:t>
         </w:r>
-      </w:hyperlink>
-    </w:p>
-    <w:p>
-      <w:pPr>
-        <w:pStyle w:val="Titre2"/>
-        <w:numPr>
-          <w:ilvl w:val="0"/>
-          <w:numId w:val="5"/>
-        </w:numPr>
-        <w:rPr>
-          <w:rFonts w:ascii="Inter" w:eastAsia="Inter" w:hAnsi="Inter" w:cs="Inter"/>
-          <w:b/>
-          <w:sz w:val="24"/>
-          <w:szCs w:val="24"/>
-          <w:lang w:val="fr-FR"/>
-        </w:rPr>
-      </w:pPr>
-      <w:r>
-        <w:rPr>
-          <w:rFonts w:ascii="Inter" w:eastAsia="Inter" w:hAnsi="Inter" w:cs="Inter"/>
-          <w:b/>
-          <w:sz w:val="24"/>
-          <w:szCs w:val="24"/>
-          <w:lang w:val="fr-FR"/>
-        </w:rPr>
-        <w:lastRenderedPageBreak/>
-        <w:t>Explique la modernisation progressive des CNN (7 étapes de transformation de ResNet vers ConvNeXt)</w:t>
-      </w:r>
-    </w:p>
-    <w:p>
-      <w:pPr>
-        <w:pStyle w:val="Titre2"/>
-        <w:numPr>
-          <w:ilvl w:val="0"/>
-          <w:numId w:val="5"/>
-        </w:numPr>
-        <w:rPr>
-          <w:rFonts w:ascii="Inter" w:eastAsia="Inter" w:hAnsi="Inter" w:cs="Inter"/>
-          <w:b/>
-          <w:sz w:val="24"/>
-          <w:szCs w:val="24"/>
-          <w:lang w:val="fr-FR"/>
-        </w:rPr>
-      </w:pPr>
-      <w:r>
-        <w:rPr>
-          <w:rFonts w:ascii="Inter" w:eastAsia="Inter" w:hAnsi="Inter" w:cs="Inter"/>
-          <w:b/>
-          <w:sz w:val="24"/>
-          <w:szCs w:val="24"/>
-          <w:lang w:val="fr-FR"/>
-        </w:rPr>
-        <w:t>Permet de comprendre comment ConvNeXt intègre les principes des Transformers dans une architecture convolutionnelle</w:t>
-      </w:r>
-    </w:p>
-    <w:p>
-      <w:pPr>
-        <w:pStyle w:val="Titre2"/>
-        <w:rPr>
-          <w:rFonts w:ascii="Inter" w:eastAsia="Inter" w:hAnsi="Inter" w:cs="Inter"/>
-          <w:b/>
-          <w:bCs/>
-          <w:sz w:val="28"/>
-          <w:szCs w:val="28"/>
-          <w:u w:val="single"/>
-          <w:lang w:val="fr-FR"/>
-        </w:rPr>
-      </w:pPr>
-      <w:r>
-        <w:rPr>
-          <w:rFonts w:ascii="Inter" w:eastAsia="Inter" w:hAnsi="Inter" w:cs="Inter"/>
-          <w:b/>
-          <w:bCs/>
-          <w:sz w:val="28"/>
-          <w:szCs w:val="28"/>
-          <w:u w:val="single"/>
-          <w:lang w:val="fr-FR"/>
-        </w:rPr>
-        <w:t>Média reconnu en data science</w:t>
-      </w:r>
-    </w:p>
-    <w:p>
-      <w:pPr>
-        <w:pStyle w:val="Titre2"/>
-        <w:rPr>
-          <w:rFonts w:ascii="Inter" w:eastAsia="Inter" w:hAnsi="Inter" w:cs="Inter"/>
-          <w:b/>
-          <w:sz w:val="24"/>
-          <w:szCs w:val="24"/>
-          <w:lang w:val="fr-FR"/>
-        </w:rPr>
-      </w:pPr>
-      <w:r>
-        <w:rPr>
-          <w:rFonts w:ascii="Inter" w:eastAsia="Inter" w:hAnsi="Inter" w:cs="Inter"/>
-          <w:b/>
-          <w:bCs/>
-          <w:sz w:val="24"/>
-          <w:szCs w:val="24"/>
-          <w:lang w:val="fr-FR"/>
-        </w:rPr>
-        <w:t>KDnuggets - Computer Vision Trends 2022</w:t>
-      </w:r>
-    </w:p>
-    <w:p>
-      <w:pPr>
-        <w:pStyle w:val="Titre2"/>
-        <w:numPr>
-          <w:ilvl w:val="0"/>
-          <w:numId w:val="6"/>
-        </w:numPr>
-        <w:rPr>
-          <w:rFonts w:ascii="Inter" w:eastAsia="Inter" w:hAnsi="Inter" w:cs="Inter"/>
-          <w:b/>
-          <w:sz w:val="24"/>
-          <w:szCs w:val="24"/>
-          <w:lang w:val="fr-FR"/>
-        </w:rPr>
-      </w:pPr>
-      <w:hyperlink r:id="rId11" w:history="1">
         <w:r>
           <w:rPr>
             <w:rStyle w:val="Lienhypertexte"/>
@@ -863,9 +941,9 @@
             <w:b/>
             <w:sz w:val="24"/>
             <w:szCs w:val="24"/>
-            <w:lang w:val="fr-FR"/>
+            <w:lang w:val="en-US"/>
           </w:rPr>
-          <w:t>https://www.kdnuggets.com/2022/04/computer-vision-trends-2022.html</w:t>
+          <w:t xml:space="preserve"> </w:t>
         </w:r>
       </w:hyperlink>
     </w:p>
@@ -890,49 +968,8 @@
           <w:b/>
           <w:sz w:val="24"/>
           <w:szCs w:val="24"/>
-          <w:lang w:val="fr-FR"/>
-        </w:rPr>
-        <w:t xml:space="preserve">Contexte sur l'évolution des architectures : CNN classiques </w:t>
-      </w:r>
-      <w:r>
-        <w:rPr>
-          <w:rFonts w:ascii="Inter" w:eastAsia="Inter" w:hAnsi="Inter" w:cs="Times New Roman"/>
-          <w:b/>
-          <w:sz w:val="24"/>
-          <w:szCs w:val="24"/>
-          <w:lang w:val="fr-FR"/>
-        </w:rPr>
-        <w:t>→</w:t>
-      </w:r>
-      <w:r>
-        <w:rPr>
-          <w:rFonts w:ascii="Inter" w:eastAsia="Inter" w:hAnsi="Inter" w:cs="Inter"/>
-          <w:b/>
-          <w:sz w:val="24"/>
-          <w:szCs w:val="24"/>
-          <w:lang w:val="fr-FR"/>
-        </w:rPr>
-        <w:t xml:space="preserve"> Vision Transformers </w:t>
-      </w:r>
-      <w:r>
-        <w:rPr>
-          <w:rFonts w:ascii="Inter" w:eastAsia="Inter" w:hAnsi="Inter" w:cs="Times New Roman"/>
-          <w:b/>
-          <w:sz w:val="24"/>
-          <w:szCs w:val="24"/>
-          <w:lang w:val="fr-FR"/>
-        </w:rPr>
-        <w:t>→</w:t>
-      </w:r>
-      <w:r>
-        <w:rPr>
-          <w:rFonts w:ascii="Inter" w:eastAsia="Inter" w:hAnsi="Inter" w:cs="Inter"/>
-          <w:b/>
-          <w:sz w:val="24"/>
-          <w:szCs w:val="24"/>
-          <w:lang w:val="fr-FR"/>
-        </w:rPr>
-        <w:t xml:space="preserve"> Architectures hybrides (ConvNeXt, </w:t>
+        </w:rPr>
+        <w:t>Contexte sur l'évolution des architectures : l'émergence des "</w:t>
       </w:r>
       <w:proofErr w:type="spellStart"/>
       <w:r>
@@ -941,9 +978,8 @@
           <w:b/>
           <w:sz w:val="24"/>
           <w:szCs w:val="24"/>
-          <w:lang w:val="fr-FR"/>
-        </w:rPr>
-        <w:t>CoAtNet</w:t>
+        </w:rPr>
+        <w:t>Foundation</w:t>
       </w:r>
       <w:proofErr w:type="spellEnd"/>
       <w:r>
@@ -952,9 +988,38 @@
           <w:b/>
           <w:sz w:val="24"/>
           <w:szCs w:val="24"/>
-          <w:lang w:val="fr-FR"/>
-        </w:rPr>
-        <w:t>)</w:t>
+        </w:rPr>
+        <w:t xml:space="preserve"> </w:t>
+      </w:r>
+      <w:proofErr w:type="spellStart"/>
+      <w:r>
+        <w:rPr>
+          <w:rFonts w:ascii="Inter" w:eastAsia="Inter" w:hAnsi="Inter" w:cs="Inter"/>
+          <w:b/>
+          <w:sz w:val="24"/>
+          <w:szCs w:val="24"/>
+        </w:rPr>
+        <w:t>Models</w:t>
+      </w:r>
+      <w:proofErr w:type="spellEnd"/>
+      <w:r>
+        <w:rPr>
+          <w:rFonts w:ascii="Inter" w:eastAsia="Inter" w:hAnsi="Inter" w:cs="Inter"/>
+          <w:b/>
+          <w:sz w:val="24"/>
+          <w:szCs w:val="24"/>
+        </w:rPr>
+        <w:t>" (modèles de fondation) qui s'imposent comme le nouveau standard en IA, y compris dans le domaine de la vision par ordinateur.</w:t>
+      </w:r>
+      <w:r>
+        <w:rPr>
+          <w:rFonts w:ascii="Inter" w:eastAsia="Inter" w:hAnsi="Inter" w:cs="Inter"/>
+          <w:b/>
+          <w:sz w:val="24"/>
+          <w:szCs w:val="24"/>
+          <w:lang w:val="fr-FR"/>
+        </w:rPr>
+        <w:t xml:space="preserve"> </w:t>
       </w:r>
     </w:p>
     <w:p>
@@ -1017,103 +1082,20 @@
           <w:b/>
           <w:sz w:val="24"/>
           <w:szCs w:val="24"/>
-          <w:lang w:val="fr-FR"/>
-        </w:rPr>
-      </w:pPr>
-      <w:r>
-        <w:rPr>
-          <w:rFonts w:ascii="Inter" w:eastAsia="Inter" w:hAnsi="Inter" w:cs="Inter"/>
-          <w:b/>
-          <w:bCs/>
-          <w:sz w:val="24"/>
-          <w:szCs w:val="24"/>
-          <w:lang w:val="fr-FR"/>
+          <w:lang w:val="en-US"/>
+        </w:rPr>
+      </w:pPr>
+      <w:r>
+        <w:rPr>
+          <w:rFonts w:ascii="Inter" w:eastAsia="Inter" w:hAnsi="Inter" w:cs="Inter"/>
+          <w:b/>
+          <w:bCs/>
+          <w:sz w:val="24"/>
+          <w:szCs w:val="24"/>
+          <w:lang w:val="en-US"/>
         </w:rPr>
         <w:t xml:space="preserve">"Vision Transformers vs </w:t>
       </w:r>
-      <w:proofErr w:type="spellStart"/>
-      <w:r>
-        <w:rPr>
-          <w:rFonts w:ascii="Inter" w:eastAsia="Inter" w:hAnsi="Inter" w:cs="Inter"/>
-          <w:b/>
-          <w:bCs/>
-          <w:sz w:val="24"/>
-          <w:szCs w:val="24"/>
-          <w:lang w:val="fr-FR"/>
-        </w:rPr>
-        <w:t>CNNs</w:t>
-      </w:r>
-      <w:proofErr w:type="spellEnd"/>
-      <w:r>
-        <w:rPr>
-          <w:rFonts w:ascii="Inter" w:eastAsia="Inter" w:hAnsi="Inter" w:cs="Inter"/>
-          <w:b/>
-          <w:bCs/>
-          <w:sz w:val="24"/>
-          <w:szCs w:val="24"/>
-          <w:lang w:val="fr-FR"/>
-        </w:rPr>
-        <w:t xml:space="preserve"> </w:t>
-      </w:r>
-      <w:r>
-        <w:rPr>
-          <w:rFonts w:ascii="Inter" w:eastAsia="Inter" w:hAnsi="Inter" w:cs="Inter"/>
-          <w:b/>
-          <w:bCs/>
-          <w:sz w:val="24"/>
-          <w:szCs w:val="24"/>
-          <w:lang w:val="fr-FR"/>
-        </w:rPr>
-        <w:t xml:space="preserve">: </w:t>
-      </w:r>
-      <w:proofErr w:type="spellStart"/>
-      <w:r>
-        <w:rPr>
-          <w:rFonts w:ascii="Inter" w:eastAsia="Inter" w:hAnsi="Inter" w:cs="Inter"/>
-          <w:b/>
-          <w:bCs/>
-          <w:sz w:val="24"/>
-          <w:szCs w:val="24"/>
-          <w:lang w:val="fr-FR"/>
-        </w:rPr>
-        <w:t>Which</w:t>
-      </w:r>
-      <w:proofErr w:type="spellEnd"/>
-      <w:r>
-        <w:rPr>
-          <w:rFonts w:ascii="Inter" w:eastAsia="Inter" w:hAnsi="Inter" w:cs="Inter"/>
-          <w:b/>
-          <w:bCs/>
-          <w:sz w:val="24"/>
-          <w:szCs w:val="24"/>
-          <w:lang w:val="fr-FR"/>
-        </w:rPr>
-        <w:t xml:space="preserve"> </w:t>
-      </w:r>
-      <w:proofErr w:type="spellStart"/>
-      <w:r>
-        <w:rPr>
-          <w:rFonts w:ascii="Inter" w:eastAsia="Inter" w:hAnsi="Inter" w:cs="Inter"/>
-          <w:b/>
-          <w:bCs/>
-          <w:sz w:val="24"/>
-          <w:szCs w:val="24"/>
-          <w:lang w:val="fr-FR"/>
-        </w:rPr>
-        <w:t>is</w:t>
-      </w:r>
-      <w:proofErr w:type="spellEnd"/>
-      <w:r>
-        <w:rPr>
-          <w:rFonts w:ascii="Inter" w:eastAsia="Inter" w:hAnsi="Inter" w:cs="Inter"/>
-          <w:b/>
-          <w:bCs/>
-          <w:sz w:val="24"/>
-          <w:szCs w:val="24"/>
-          <w:lang w:val="fr-FR"/>
-        </w:rPr>
-        <w:t xml:space="preserve"> </w:t>
-      </w:r>
       <w:proofErr w:type="gramStart"/>
       <w:r>
         <w:rPr>
@@ -1122,9 +1104,9 @@
           <w:bCs/>
           <w:sz w:val="24"/>
           <w:szCs w:val="24"/>
-          <w:lang w:val="fr-FR"/>
-        </w:rPr>
-        <w:t>Better?</w:t>
+          <w:lang w:val="en-US"/>
+        </w:rPr>
+        <w:t>CNNs :</w:t>
       </w:r>
       <w:proofErr w:type="gramEnd"/>
       <w:r>
@@ -1134,17 +1116,17 @@
           <w:bCs/>
           <w:sz w:val="24"/>
           <w:szCs w:val="24"/>
-          <w:lang w:val="fr-FR"/>
-        </w:rPr>
-        <w:t>"</w:t>
-      </w:r>
-      <w:r>
-        <w:rPr>
-          <w:rFonts w:ascii="Inter" w:eastAsia="Inter" w:hAnsi="Inter" w:cs="Inter"/>
-          <w:b/>
-          <w:sz w:val="24"/>
-          <w:szCs w:val="24"/>
-          <w:lang w:val="fr-FR"/>
+          <w:lang w:val="en-US"/>
+        </w:rPr>
+        <w:t xml:space="preserve"> Which is Better?"</w:t>
+      </w:r>
+      <w:r>
+        <w:rPr>
+          <w:rFonts w:ascii="Inter" w:eastAsia="Inter" w:hAnsi="Inter" w:cs="Inter"/>
+          <w:b/>
+          <w:sz w:val="24"/>
+          <w:szCs w:val="24"/>
+          <w:lang w:val="en-US"/>
         </w:rPr>
         <w:t xml:space="preserve"> par Analytics Vidhya</w:t>
       </w:r>
@@ -1159,24 +1141,37 @@
         <w:rPr>
           <w:rFonts w:ascii="Inter" w:eastAsia="Inter" w:hAnsi="Inter" w:cs="Inter"/>
           <w:b/>
-          <w:sz w:val="24"/>
-          <w:szCs w:val="24"/>
-          <w:lang w:val="fr-FR"/>
+          <w:bCs/>
+          <w:sz w:val="24"/>
+          <w:szCs w:val="24"/>
+          <w:lang w:val="en-US"/>
         </w:rPr>
       </w:pPr>
       <w:hyperlink r:id="rId12" w:history="1">
         <w:r>
           <w:rPr>
             <w:rStyle w:val="Lienhypertexte"/>
-            <w:rFonts w:ascii="Inter" w:eastAsia="Inter" w:hAnsi="Inter" w:cs="Inter"/>
+            <w:rFonts w:ascii="Inter" w:hAnsi="Inter"/>
             <w:b/>
+            <w:bCs/>
             <w:sz w:val="24"/>
             <w:szCs w:val="24"/>
-            <w:lang w:val="fr-FR"/>
+            <w:lang w:val="en-US"/>
           </w:rPr>
-          <w:t>https://www.analyticsvidhya.com/blog/2022/01/vision-transformers-vs-cnns/</w:t>
+          <w:t>https://www.analyticsvidhya.com/blog/2023/05/introduction-to-vision-transformers-vit</w:t>
         </w:r>
       </w:hyperlink>
+      <w:r>
+        <w:rPr>
+          <w:rFonts w:ascii="Inter" w:hAnsi="Inter"/>
+          <w:b/>
+          <w:bCs/>
+          <w:sz w:val="24"/>
+          <w:szCs w:val="24"/>
+          <w:lang w:val="en-US"/>
+        </w:rPr>
+        <w:t xml:space="preserve"> </w:t>
+      </w:r>
     </w:p>
     <w:p>
       <w:pPr>
@@ -1199,9 +1194,18 @@
           <w:b/>
           <w:sz w:val="24"/>
           <w:szCs w:val="24"/>
-          <w:lang w:val="fr-FR"/>
-        </w:rPr>
-        <w:t>Comparaison objective entre approches CNN et Transformer</w:t>
+        </w:rPr>
+        <w:t>Contexte sur l'évolution des architectures : comparaison directe entre l'approche séquentielle des réseaux convolutifs classiques (CNN) et l'architecture des Vision Transformers.</w:t>
+      </w:r>
+      <w:r>
+        <w:rPr>
+          <w:rFonts w:ascii="Inter" w:eastAsia="Inter" w:hAnsi="Inter" w:cs="Inter"/>
+          <w:b/>
+          <w:sz w:val="24"/>
+          <w:szCs w:val="24"/>
+          <w:lang w:val="fr-FR"/>
+        </w:rPr>
+        <w:t xml:space="preserve"> </w:t>
       </w:r>
     </w:p>
     <w:p>
@@ -1227,7 +1231,29 @@
           <w:szCs w:val="24"/>
           <w:lang w:val="fr-FR"/>
         </w:rPr>
-        <w:t>Justifie le choix de ConvNeXt comme architecture moderne s'inscrivant dans l'état de l'art 2022-2024</w:t>
+        <w:t xml:space="preserve">Justifie le choix de </w:t>
+      </w:r>
+      <w:proofErr w:type="spellStart"/>
+      <w:r>
+        <w:rPr>
+          <w:rFonts w:ascii="Inter" w:eastAsia="Inter" w:hAnsi="Inter" w:cs="Inter"/>
+          <w:b/>
+          <w:sz w:val="24"/>
+          <w:szCs w:val="24"/>
+          <w:lang w:val="fr-FR"/>
+        </w:rPr>
+        <w:t>ConvNeXt</w:t>
+      </w:r>
+      <w:proofErr w:type="spellEnd"/>
+      <w:r>
+        <w:rPr>
+          <w:rFonts w:ascii="Inter" w:eastAsia="Inter" w:hAnsi="Inter" w:cs="Inter"/>
+          <w:b/>
+          <w:sz w:val="24"/>
+          <w:szCs w:val="24"/>
+          <w:lang w:val="fr-FR"/>
+        </w:rPr>
+        <w:t xml:space="preserve"> comme architecture moderne s'inscrivant dans l'état de l'art 2022-2024</w:t>
       </w:r>
     </w:p>
     <w:p>
@@ -1245,8 +1271,19 @@
         <w:rPr>
           <w:rFonts w:ascii="Georgia" w:eastAsia="Inter" w:hAnsi="Georgia" w:cs="Inter"/>
           <w:b/>
-        </w:rPr>
-      </w:pPr>
+          <w:lang w:val="fr-FR"/>
+        </w:rPr>
+      </w:pPr>
+      <w:r>
+        <w:rPr>
+          <w:rFonts w:ascii="Georgia" w:eastAsia="Inter" w:hAnsi="Georgia" w:cs="Inter"/>
+          <w:b/>
+          <w:bCs/>
+          <w:lang w:val="fr-FR"/>
+        </w:rPr>
+        <w:lastRenderedPageBreak/>
+        <w:t>Explication de la démarche de test du nouvel algorithme (le POC)</w:t>
+      </w:r>
     </w:p>
     <w:p>
       <w:pPr>
@@ -1254,199 +1291,590 @@
         <w:rPr>
           <w:rFonts w:ascii="Georgia" w:eastAsia="Inter" w:hAnsi="Georgia" w:cs="Inter"/>
           <w:b/>
-        </w:rPr>
-      </w:pPr>
-      <w:r>
-        <w:rPr>
-          <w:rFonts w:ascii="Georgia" w:eastAsia="Inter" w:hAnsi="Georgia" w:cs="Inter"/>
-          <w:b/>
+          <w:lang w:val="fr-FR"/>
+        </w:rPr>
+      </w:pPr>
+      <w:r>
+        <w:rPr>
+          <w:rFonts w:ascii="Georgia" w:eastAsia="Inter" w:hAnsi="Georgia" w:cs="Inter"/>
+          <w:b/>
+          <w:lang w:val="fr-FR"/>
+        </w:rPr>
+        <w:t xml:space="preserve">On va repartir du </w:t>
+      </w:r>
+      <w:proofErr w:type="spellStart"/>
+      <w:r>
+        <w:rPr>
+          <w:rFonts w:ascii="Georgia" w:eastAsia="Inter" w:hAnsi="Georgia" w:cs="Inter"/>
+          <w:b/>
+          <w:lang w:val="fr-FR"/>
+        </w:rPr>
+        <w:t>dataset</w:t>
+      </w:r>
+      <w:proofErr w:type="spellEnd"/>
+      <w:r>
+        <w:rPr>
+          <w:rFonts w:ascii="Georgia" w:eastAsia="Inter" w:hAnsi="Georgia" w:cs="Inter"/>
+          <w:b/>
+          <w:lang w:val="fr-FR"/>
+        </w:rPr>
+        <w:t xml:space="preserve"> des races de chiens, mais cette fois-ci, on va corser l’exercice en entraînant les 120 races de chiens et donc environ 20000 photos de bonne qualité. Normalement, le % de prédictions devrait être beaucoup plus dur à atteindre que sur un set de 3 races, mais on va prouver avec ce modèle qu’on peut atteindre un excellent taux de prédictions.</w:t>
+      </w:r>
+    </w:p>
+    <w:p>
+      <w:pPr>
+        <w:pStyle w:val="Titre2"/>
+        <w:rPr>
+          <w:rFonts w:ascii="Georgia" w:eastAsia="Inter" w:hAnsi="Georgia" w:cs="Inter"/>
+          <w:b/>
+          <w:lang w:val="fr-FR"/>
+        </w:rPr>
+      </w:pPr>
+      <w:r>
+        <w:rPr>
+          <w:rFonts w:ascii="Georgia" w:eastAsia="Inter" w:hAnsi="Georgia" w:cs="Inter"/>
+          <w:b/>
+          <w:lang w:val="fr-FR"/>
+        </w:rPr>
+        <w:t xml:space="preserve">Une comparaison sera effectuée avec le modèle de Transfer Learning utilisé lors du projet précédent (mobileNetV2). Pour comparer les 2 modèles, on utilisera 2 métriques : top1 </w:t>
+      </w:r>
+      <w:proofErr w:type="spellStart"/>
+      <w:r>
+        <w:rPr>
+          <w:rFonts w:ascii="Georgia" w:eastAsia="Inter" w:hAnsi="Georgia" w:cs="Inter"/>
+          <w:b/>
+          <w:lang w:val="fr-FR"/>
+        </w:rPr>
+        <w:t>accuracy</w:t>
+      </w:r>
+      <w:proofErr w:type="spellEnd"/>
+      <w:r>
+        <w:rPr>
+          <w:rFonts w:ascii="Georgia" w:eastAsia="Inter" w:hAnsi="Georgia" w:cs="Inter"/>
+          <w:b/>
+          <w:lang w:val="fr-FR"/>
+        </w:rPr>
+        <w:t xml:space="preserve"> et top-5 </w:t>
+      </w:r>
+      <w:proofErr w:type="spellStart"/>
+      <w:r>
+        <w:rPr>
+          <w:rFonts w:ascii="Georgia" w:eastAsia="Inter" w:hAnsi="Georgia" w:cs="Inter"/>
+          <w:b/>
+          <w:lang w:val="fr-FR"/>
+        </w:rPr>
+        <w:t>acuracy</w:t>
+      </w:r>
+      <w:proofErr w:type="spellEnd"/>
+      <w:r>
+        <w:rPr>
+          <w:rFonts w:ascii="Georgia" w:eastAsia="Inter" w:hAnsi="Georgia" w:cs="Inter"/>
+          <w:b/>
+          <w:lang w:val="fr-FR"/>
+        </w:rPr>
+        <w:t xml:space="preserve"> (important en fine-</w:t>
+      </w:r>
+      <w:proofErr w:type="spellStart"/>
+      <w:r>
+        <w:rPr>
+          <w:rFonts w:ascii="Georgia" w:eastAsia="Inter" w:hAnsi="Georgia" w:cs="Inter"/>
+          <w:b/>
+          <w:lang w:val="fr-FR"/>
+        </w:rPr>
+        <w:t>grained</w:t>
+      </w:r>
+      <w:proofErr w:type="spellEnd"/>
+      <w:r>
+        <w:rPr>
+          <w:rFonts w:ascii="Georgia" w:eastAsia="Inter" w:hAnsi="Georgia" w:cs="Inter"/>
+          <w:b/>
+          <w:lang w:val="fr-FR"/>
+        </w:rPr>
+        <w:t>).</w:t>
+      </w:r>
+    </w:p>
+    <w:p>
+      <w:pPr>
+        <w:pStyle w:val="Titre2"/>
+        <w:rPr>
+          <w:rFonts w:ascii="Georgia" w:eastAsia="Inter" w:hAnsi="Georgia" w:cs="Inter"/>
+          <w:b/>
+          <w:lang w:val="fr-FR"/>
+        </w:rPr>
+      </w:pPr>
+      <w:r>
+        <w:rPr>
+          <w:rFonts w:ascii="Georgia" w:eastAsia="Inter" w:hAnsi="Georgia" w:cs="Inter"/>
+          <w:b/>
+          <w:lang w:val="fr-FR"/>
+        </w:rPr>
+        <w:t>On démontrera aussi que ce modèle va permettre de distinguer mieux 2 races de chien assez similaires, ayant très peu de caractéristiques distinctes</w:t>
+      </w:r>
+    </w:p>
+    <w:p>
+      <w:pPr>
+        <w:pStyle w:val="Titre2"/>
+        <w:rPr>
+          <w:rFonts w:ascii="Georgia" w:eastAsia="Inter" w:hAnsi="Georgia" w:cs="Inter"/>
+          <w:b/>
+          <w:lang w:val="fr-FR"/>
+        </w:rPr>
+      </w:pPr>
+      <w:r>
+        <w:rPr>
+          <w:rFonts w:ascii="Georgia" w:eastAsia="Inter" w:hAnsi="Georgia" w:cs="Inter"/>
+          <w:b/>
+          <w:lang w:val="fr-FR"/>
+        </w:rPr>
+        <w:t xml:space="preserve">On présentera le travail grâce à une interface parlante pour le client final (ici OpenClassrooms) probablement sur </w:t>
+      </w:r>
+      <w:proofErr w:type="spellStart"/>
+      <w:r>
+        <w:rPr>
+          <w:rFonts w:ascii="Georgia" w:eastAsia="Inter" w:hAnsi="Georgia" w:cs="Inter"/>
+          <w:b/>
+          <w:lang w:val="fr-FR"/>
+        </w:rPr>
+        <w:t>streamlit</w:t>
+      </w:r>
+      <w:proofErr w:type="spellEnd"/>
+      <w:r>
+        <w:rPr>
+          <w:rFonts w:ascii="Georgia" w:eastAsia="Inter" w:hAnsi="Georgia" w:cs="Inter"/>
+          <w:b/>
+          <w:lang w:val="fr-FR"/>
+        </w:rPr>
+        <w:t xml:space="preserve">. </w:t>
+      </w:r>
+    </w:p>
+    <w:p>
+      <w:pPr>
+        <w:pStyle w:val="Titre2"/>
+        <w:rPr>
+          <w:rFonts w:ascii="Georgia" w:eastAsia="Inter" w:hAnsi="Georgia" w:cs="Inter"/>
+          <w:b/>
+          <w:lang w:val="fr-FR"/>
+        </w:rPr>
+      </w:pPr>
+      <w:r>
+        <w:rPr>
+          <w:rFonts w:ascii="Georgia" w:eastAsia="Inter" w:hAnsi="Georgia" w:cs="Inter"/>
+          <w:b/>
+          <w:bCs/>
+          <w:lang w:val="fr-FR"/>
+        </w:rPr>
+        <w:t xml:space="preserve">Autre modèle à tester : DINOv3 </w:t>
+      </w:r>
+      <w:proofErr w:type="spellStart"/>
+      <w:r>
+        <w:rPr>
+          <w:rFonts w:ascii="Georgia" w:eastAsia="Inter" w:hAnsi="Georgia" w:cs="Inter"/>
+          <w:b/>
+          <w:bCs/>
+          <w:lang w:val="fr-FR"/>
+        </w:rPr>
+        <w:t>ViT</w:t>
+      </w:r>
+      <w:proofErr w:type="spellEnd"/>
+      <w:r>
+        <w:rPr>
+          <w:rFonts w:ascii="Georgia" w:eastAsia="Inter" w:hAnsi="Georgia" w:cs="Inter"/>
+          <w:b/>
+          <w:bCs/>
+          <w:lang w:val="fr-FR"/>
+        </w:rPr>
+        <w:t>-B/16 (Meta AI)</w:t>
+      </w:r>
+    </w:p>
+    <w:p>
+      <w:pPr>
+        <w:pStyle w:val="Titre2"/>
+        <w:rPr>
+          <w:rFonts w:ascii="Georgia" w:eastAsia="Inter" w:hAnsi="Georgia" w:cs="Inter"/>
+          <w:b/>
+          <w:lang w:val="fr-FR"/>
+        </w:rPr>
+      </w:pPr>
+      <w:r>
+        <w:rPr>
+          <w:rFonts w:ascii="Georgia" w:eastAsia="Inter" w:hAnsi="Georgia" w:cs="Inter"/>
+          <w:b/>
+          <w:u w:val="single"/>
+          <w:lang w:val="fr-FR"/>
         </w:rPr>
         <w:lastRenderedPageBreak/>
-        <w:t xml:space="preserve">Explication de </w:t>
-      </w:r>
-      <w:r>
-        <w:rPr>
-          <w:rFonts w:ascii="Georgia" w:eastAsia="Inter" w:hAnsi="Georgia" w:cs="Inter"/>
-          <w:b/>
-        </w:rPr>
-        <w:t>la</w:t>
-      </w:r>
-      <w:r>
-        <w:rPr>
-          <w:rFonts w:ascii="Georgia" w:eastAsia="Inter" w:hAnsi="Georgia" w:cs="Inter"/>
-          <w:b/>
-        </w:rPr>
-        <w:t xml:space="preserve"> démarche de test du nouvel algorithme (</w:t>
-      </w:r>
-      <w:r>
-        <w:rPr>
-          <w:rFonts w:ascii="Georgia" w:eastAsia="Inter" w:hAnsi="Georgia" w:cs="Inter"/>
-          <w:b/>
-        </w:rPr>
-        <w:t>le POC</w:t>
-      </w:r>
-      <w:r>
-        <w:rPr>
-          <w:rFonts w:ascii="Georgia" w:eastAsia="Inter" w:hAnsi="Georgia" w:cs="Inter"/>
-          <w:b/>
-        </w:rPr>
-        <w:t>)</w:t>
-      </w:r>
-    </w:p>
-    <w:p>
-      <w:pPr>
-        <w:shd w:val="clear" w:color="auto" w:fill="FFFFFF"/>
-        <w:spacing w:before="240" w:after="240"/>
-        <w:rPr>
-          <w:rFonts w:ascii="Inter" w:eastAsia="Inter" w:hAnsi="Inter" w:cs="Inter"/>
+        <w:t xml:space="preserve">Pour aller plus loin </w:t>
+      </w:r>
+      <w:r>
+        <w:rPr>
+          <w:rFonts w:ascii="Georgia" w:eastAsia="Inter" w:hAnsi="Georgia" w:cs="Inter"/>
+          <w:b/>
+          <w:lang w:val="fr-FR"/>
+        </w:rPr>
+        <w:t xml:space="preserve">dans la comparaison, nous ajoutons un troisième modèle : </w:t>
+      </w:r>
+      <w:r>
+        <w:rPr>
+          <w:rFonts w:ascii="Georgia" w:eastAsia="Inter" w:hAnsi="Georgia" w:cs="Inter"/>
+          <w:b/>
+          <w:bCs/>
+          <w:lang w:val="fr-FR"/>
+        </w:rPr>
+        <w:t xml:space="preserve">DINOv3 </w:t>
+      </w:r>
+      <w:proofErr w:type="spellStart"/>
+      <w:r>
+        <w:rPr>
+          <w:rFonts w:ascii="Georgia" w:eastAsia="Inter" w:hAnsi="Georgia" w:cs="Inter"/>
+          <w:b/>
+          <w:bCs/>
+          <w:lang w:val="fr-FR"/>
+        </w:rPr>
+        <w:t>ViT</w:t>
+      </w:r>
+      <w:proofErr w:type="spellEnd"/>
+      <w:r>
+        <w:rPr>
+          <w:rFonts w:ascii="Georgia" w:eastAsia="Inter" w:hAnsi="Georgia" w:cs="Inter"/>
+          <w:b/>
+          <w:bCs/>
+          <w:lang w:val="fr-FR"/>
+        </w:rPr>
+        <w:t>-B/16</w:t>
+      </w:r>
+      <w:r>
+        <w:rPr>
+          <w:rFonts w:ascii="Georgia" w:eastAsia="Inter" w:hAnsi="Georgia" w:cs="Inter"/>
+          <w:b/>
+          <w:lang w:val="fr-FR"/>
+        </w:rPr>
+        <w:t>, développé par Meta AI (</w:t>
+      </w:r>
+      <w:proofErr w:type="spellStart"/>
+      <w:r>
+        <w:rPr>
+          <w:rFonts w:ascii="Georgia" w:eastAsia="Inter" w:hAnsi="Georgia" w:cs="Inter"/>
+          <w:b/>
+          <w:lang w:val="fr-FR"/>
+        </w:rPr>
+        <w:t>Oquab</w:t>
+      </w:r>
+      <w:proofErr w:type="spellEnd"/>
+      <w:r>
+        <w:rPr>
+          <w:rFonts w:ascii="Georgia" w:eastAsia="Inter" w:hAnsi="Georgia" w:cs="Inter"/>
+          <w:b/>
+          <w:lang w:val="fr-FR"/>
+        </w:rPr>
+        <w:t xml:space="preserve"> et al., 2023). Contrairement à </w:t>
+      </w:r>
+      <w:proofErr w:type="spellStart"/>
+      <w:r>
+        <w:rPr>
+          <w:rFonts w:ascii="Georgia" w:eastAsia="Inter" w:hAnsi="Georgia" w:cs="Inter"/>
+          <w:b/>
+          <w:lang w:val="fr-FR"/>
+        </w:rPr>
+        <w:t>ConvNeXt</w:t>
+      </w:r>
+      <w:proofErr w:type="spellEnd"/>
+      <w:r>
+        <w:rPr>
+          <w:rFonts w:ascii="Georgia" w:eastAsia="Inter" w:hAnsi="Georgia" w:cs="Inter"/>
+          <w:b/>
+          <w:lang w:val="fr-FR"/>
+        </w:rPr>
+        <w:t xml:space="preserve"> qui reste un CNN modernisé, DINOv3 repose sur une architecture </w:t>
+      </w:r>
+      <w:r>
+        <w:rPr>
+          <w:rFonts w:ascii="Georgia" w:eastAsia="Inter" w:hAnsi="Georgia" w:cs="Inter"/>
+          <w:b/>
+          <w:bCs/>
+          <w:lang w:val="fr-FR"/>
+        </w:rPr>
+        <w:t>Vision Transformer (</w:t>
+      </w:r>
+      <w:proofErr w:type="spellStart"/>
+      <w:r>
+        <w:rPr>
+          <w:rFonts w:ascii="Georgia" w:eastAsia="Inter" w:hAnsi="Georgia" w:cs="Inter"/>
+          <w:b/>
+          <w:bCs/>
+          <w:lang w:val="fr-FR"/>
+        </w:rPr>
+        <w:t>ViT</w:t>
+      </w:r>
+      <w:proofErr w:type="spellEnd"/>
+      <w:r>
+        <w:rPr>
+          <w:rFonts w:ascii="Georgia" w:eastAsia="Inter" w:hAnsi="Georgia" w:cs="Inter"/>
+          <w:b/>
+          <w:bCs/>
+          <w:lang w:val="fr-FR"/>
+        </w:rPr>
+        <w:t xml:space="preserve">) </w:t>
+      </w:r>
+      <w:r>
+        <w:rPr>
+          <w:rFonts w:ascii="Georgia" w:eastAsia="Inter" w:hAnsi="Georgia" w:cs="Inter"/>
+          <w:b/>
+          <w:lang w:val="fr-FR"/>
+        </w:rPr>
+        <w:t xml:space="preserve">et adopte une approche radicalement différente : il a été pré-entraîné de manière </w:t>
+      </w:r>
+      <w:r>
+        <w:rPr>
+          <w:rFonts w:ascii="Georgia" w:eastAsia="Inter" w:hAnsi="Georgia" w:cs="Inter"/>
+          <w:b/>
+          <w:bCs/>
+          <w:lang w:val="fr-FR"/>
+        </w:rPr>
+        <w:t xml:space="preserve">auto-supervisée </w:t>
+      </w:r>
+      <w:r>
+        <w:rPr>
+          <w:rFonts w:ascii="Georgia" w:eastAsia="Inter" w:hAnsi="Georgia" w:cs="Inter"/>
+          <w:b/>
+          <w:lang w:val="fr-FR"/>
+        </w:rPr>
+        <w:t>(sans aucune annotation humaine) sur un jeu de données massif de 142 millions d'images (LVD-142M). Cette approche lui permet de produire des représentations visuelles universelles et extrêmement riches, directement transférables à notre tâche de classification.</w:t>
+      </w:r>
+    </w:p>
+    <w:p>
+      <w:pPr>
+        <w:pStyle w:val="Titre2"/>
+        <w:rPr>
+          <w:rFonts w:ascii="Georgia" w:eastAsia="Inter" w:hAnsi="Georgia" w:cs="Inter"/>
+          <w:b/>
+          <w:lang w:val="fr-FR"/>
+        </w:rPr>
+      </w:pPr>
+      <w:r>
+        <w:rPr>
+          <w:rFonts w:ascii="Georgia" w:eastAsia="Inter" w:hAnsi="Georgia" w:cs="Inter"/>
+          <w:b/>
+          <w:lang w:val="fr-FR"/>
+        </w:rPr>
+        <w:t>L'intérêt de tester DINOv3 dans ce POC est double. D'une part, sa capacité à capturer des relations globales dans l'image via le mécanisme d'</w:t>
+      </w:r>
+      <w:r>
+        <w:rPr>
+          <w:rFonts w:ascii="Georgia" w:eastAsia="Inter" w:hAnsi="Georgia" w:cs="Inter"/>
+          <w:b/>
+          <w:bCs/>
+          <w:lang w:val="fr-FR"/>
+        </w:rPr>
+        <w:t xml:space="preserve">attention multi-têtes </w:t>
+      </w:r>
+      <w:r>
+        <w:rPr>
+          <w:rFonts w:ascii="Georgia" w:eastAsia="Inter" w:hAnsi="Georgia" w:cs="Inter"/>
+          <w:b/>
+          <w:lang w:val="fr-FR"/>
+        </w:rPr>
+        <w:t xml:space="preserve">(chaque patch de 16×16 pixels "regarde" tous les autres) le rend particulièrement adapté à la distinction de races visuellement proches comme le Malamute et le Husky Sibérien. D'autre part, la comparaison avec </w:t>
+      </w:r>
+      <w:proofErr w:type="spellStart"/>
+      <w:r>
+        <w:rPr>
+          <w:rFonts w:ascii="Georgia" w:eastAsia="Inter" w:hAnsi="Georgia" w:cs="Inter"/>
+          <w:b/>
+          <w:lang w:val="fr-FR"/>
+        </w:rPr>
+        <w:t>ConvNeXt</w:t>
+      </w:r>
+      <w:proofErr w:type="spellEnd"/>
+      <w:r>
+        <w:rPr>
+          <w:rFonts w:ascii="Georgia" w:eastAsia="Inter" w:hAnsi="Georgia" w:cs="Inter"/>
+          <w:b/>
+          <w:lang w:val="fr-FR"/>
+        </w:rPr>
+        <w:t xml:space="preserve">-Tiny permettra d'évaluer le compromis entre </w:t>
+      </w:r>
+      <w:r>
+        <w:rPr>
+          <w:rFonts w:ascii="Georgia" w:eastAsia="Inter" w:hAnsi="Georgia" w:cs="Inter"/>
+          <w:b/>
+          <w:bCs/>
+          <w:lang w:val="fr-FR"/>
+        </w:rPr>
+        <w:t xml:space="preserve">puissance de représentation </w:t>
+      </w:r>
+      <w:r>
+        <w:rPr>
+          <w:rFonts w:ascii="Georgia" w:eastAsia="Inter" w:hAnsi="Georgia" w:cs="Inter"/>
+          <w:b/>
+          <w:lang w:val="fr-FR"/>
+        </w:rPr>
+        <w:t xml:space="preserve">(~86M paramètres) et </w:t>
+      </w:r>
+      <w:r>
+        <w:rPr>
+          <w:rFonts w:ascii="Georgia" w:eastAsia="Inter" w:hAnsi="Georgia" w:cs="Inter"/>
+          <w:b/>
+          <w:bCs/>
+          <w:lang w:val="fr-FR"/>
+        </w:rPr>
+        <w:t xml:space="preserve">efficacité de déploiement </w:t>
+      </w:r>
+      <w:r>
+        <w:rPr>
+          <w:rFonts w:ascii="Georgia" w:eastAsia="Inter" w:hAnsi="Georgia" w:cs="Inter"/>
+          <w:b/>
+          <w:lang w:val="fr-FR"/>
+        </w:rPr>
+        <w:t xml:space="preserve">(environ 28M de paramètres pour </w:t>
+      </w:r>
+      <w:proofErr w:type="spellStart"/>
+      <w:r>
+        <w:rPr>
+          <w:rFonts w:ascii="Georgia" w:eastAsia="Inter" w:hAnsi="Georgia" w:cs="Inter"/>
+          <w:b/>
+          <w:lang w:val="fr-FR"/>
+        </w:rPr>
+        <w:t>ConvNeXt</w:t>
+      </w:r>
+      <w:proofErr w:type="spellEnd"/>
+      <w:r>
+        <w:rPr>
+          <w:rFonts w:ascii="Georgia" w:eastAsia="Inter" w:hAnsi="Georgia" w:cs="Inter"/>
+          <w:b/>
+          <w:lang w:val="fr-FR"/>
+        </w:rPr>
+        <w:t>).</w:t>
+      </w:r>
+    </w:p>
+    <w:p>
+      <w:pPr>
+        <w:pStyle w:val="Titre2"/>
+        <w:rPr>
+          <w:rFonts w:ascii="Georgia" w:eastAsia="Inter" w:hAnsi="Georgia" w:cs="Inter"/>
+          <w:b/>
+          <w:lang w:val="fr-FR"/>
+        </w:rPr>
+      </w:pPr>
+      <w:r>
+        <w:rPr>
+          <w:rFonts w:ascii="Georgia" w:eastAsia="Inter" w:hAnsi="Georgia" w:cs="Inter"/>
+          <w:b/>
+          <w:lang w:val="fr-FR"/>
+        </w:rPr>
+        <w:t xml:space="preserve">Les trois modèles — MobileNetV2, </w:t>
+      </w:r>
+      <w:proofErr w:type="spellStart"/>
+      <w:r>
+        <w:rPr>
+          <w:rFonts w:ascii="Georgia" w:eastAsia="Inter" w:hAnsi="Georgia" w:cs="Inter"/>
+          <w:b/>
+          <w:lang w:val="fr-FR"/>
+        </w:rPr>
+        <w:t>ConvNeXt</w:t>
+      </w:r>
+      <w:proofErr w:type="spellEnd"/>
+      <w:r>
+        <w:rPr>
+          <w:rFonts w:ascii="Georgia" w:eastAsia="Inter" w:hAnsi="Georgia" w:cs="Inter"/>
+          <w:b/>
+          <w:lang w:val="fr-FR"/>
+        </w:rPr>
+        <w:t xml:space="preserve">-Tiny et DINOv3 — seront évalués sur les mêmes métriques (Top-1 et Top-5 </w:t>
+      </w:r>
+      <w:proofErr w:type="spellStart"/>
+      <w:r>
+        <w:rPr>
+          <w:rFonts w:ascii="Georgia" w:eastAsia="Inter" w:hAnsi="Georgia" w:cs="Inter"/>
+          <w:b/>
+          <w:lang w:val="fr-FR"/>
+        </w:rPr>
+        <w:t>accuracy</w:t>
+      </w:r>
+      <w:proofErr w:type="spellEnd"/>
+      <w:r>
+        <w:rPr>
+          <w:rFonts w:ascii="Georgia" w:eastAsia="Inter" w:hAnsi="Georgia" w:cs="Inter"/>
+          <w:b/>
+          <w:lang w:val="fr-FR"/>
+        </w:rPr>
+        <w:t>, et vitesse d’inférence</w:t>
+      </w:r>
+      <w:r>
+        <w:rPr>
+          <w:rFonts w:ascii="Georgia" w:eastAsia="Inter" w:hAnsi="Georgia" w:cs="Inter"/>
+          <w:b/>
+          <w:lang w:val="fr-FR"/>
+        </w:rPr>
+        <w:t xml:space="preserve">) et intégrés dans le </w:t>
+      </w:r>
+    </w:p>
+    <w:p>
+      <w:pPr>
+        <w:pStyle w:val="Titre2"/>
+        <w:rPr>
+          <w:rFonts w:ascii="Georgia" w:eastAsia="Inter" w:hAnsi="Georgia" w:cs="Inter"/>
+          <w:b/>
+          <w:lang w:val="en-US"/>
+        </w:rPr>
+      </w:pPr>
+      <w:r>
+        <w:rPr>
+          <w:rFonts w:ascii="Georgia" w:eastAsia="Inter" w:hAnsi="Georgia" w:cs="Inter"/>
+          <w:b/>
+          <w:lang w:val="en-US"/>
+        </w:rPr>
+        <w:lastRenderedPageBreak/>
+        <w:t xml:space="preserve">Ludivine Goldstein – P07 – Proof of concept – OpenClassrooms 2026 </w:t>
+      </w:r>
+    </w:p>
+    <w:p>
+      <w:pPr>
+        <w:pStyle w:val="Titre2"/>
+        <w:rPr>
+          <w:rFonts w:ascii="Inter" w:eastAsia="Inter" w:hAnsi="Inter" w:cs="Inter"/>
+          <w:b/>
+          <w:bCs/>
           <w:iCs/>
           <w:highlight w:val="white"/>
         </w:rPr>
       </w:pPr>
-      <w:r>
-        <w:rPr>
-          <w:rFonts w:ascii="Inter" w:eastAsia="Inter" w:hAnsi="Inter" w:cs="Inter"/>
-          <w:iCs/>
-          <w:highlight w:val="white"/>
-        </w:rPr>
-        <w:t xml:space="preserve">On va repartir du dataset des races de chiens, mais cette fois-ci, on va corser l’exercice en entraînant les 120 races de chiens et donc </w:t>
-      </w:r>
-      <w:r>
-        <w:rPr>
-          <w:rFonts w:ascii="Inter" w:eastAsia="Inter" w:hAnsi="Inter" w:cs="Inter"/>
-          <w:iCs/>
-          <w:highlight w:val="white"/>
-        </w:rPr>
-        <w:t>environ 20000 photos de bonne qualité. Normalement, le % de prédictions devrait être beaucoup plus dur à atteindre que sur un set de 3 races, mais on va prouver avec ce modèle qu’on peut atteindre un excellent taux de prédictions.</w:t>
-      </w:r>
-    </w:p>
-    <w:p>
-      <w:pPr>
-        <w:shd w:val="clear" w:color="auto" w:fill="FFFFFF"/>
-        <w:spacing w:before="240" w:after="240"/>
-        <w:rPr>
-          <w:rFonts w:ascii="Inter" w:eastAsia="Inter" w:hAnsi="Inter" w:cs="Inter"/>
-          <w:iCs/>
-          <w:highlight w:val="white"/>
-        </w:rPr>
-      </w:pPr>
-      <w:r>
-        <w:rPr>
-          <w:rFonts w:ascii="Inter" w:eastAsia="Inter" w:hAnsi="Inter" w:cs="Inter"/>
-          <w:iCs/>
-          <w:highlight w:val="white"/>
-        </w:rPr>
-        <w:t>Une comparaison sera effectuée avec le modèle de Transfer Learning utilisé lors du projet précédent (mobileNetV2). Pour comparer les 2 modèles, on utilisera 2 métriques : top1 accuracy et top-5 acuracy (important en fine-grained).</w:t>
-      </w:r>
-    </w:p>
-    <w:p>
-      <w:pPr>
-        <w:shd w:val="clear" w:color="auto" w:fill="FFFFFF"/>
-        <w:spacing w:before="240" w:after="240"/>
-        <w:rPr>
-          <w:rFonts w:ascii="Inter" w:eastAsia="Inter" w:hAnsi="Inter" w:cs="Inter"/>
-          <w:iCs/>
-          <w:highlight w:val="white"/>
-        </w:rPr>
-      </w:pPr>
-      <w:r>
-        <w:rPr>
-          <w:rFonts w:ascii="Inter" w:eastAsia="Inter" w:hAnsi="Inter" w:cs="Inter"/>
-          <w:iCs/>
-          <w:highlight w:val="white"/>
-        </w:rPr>
-        <w:t>On démontrera aussi que ce modèle va permettre de distinguer mieux 2 races de chien assez similaires, ayant très peu de caractéristiques distinctes</w:t>
-      </w:r>
-    </w:p>
-    <w:p>
-      <w:pPr>
-        <w:shd w:val="clear" w:color="auto" w:fill="FFFFFF"/>
-        <w:spacing w:before="240" w:after="240"/>
-        <w:rPr>
-          <w:rFonts w:ascii="Inter" w:eastAsia="Inter" w:hAnsi="Inter" w:cs="Inter"/>
-          <w:iCs/>
-          <w:highlight w:val="white"/>
-        </w:rPr>
-      </w:pPr>
-      <w:r>
-        <w:rPr>
-          <w:rFonts w:ascii="Inter" w:eastAsia="Inter" w:hAnsi="Inter" w:cs="Inter"/>
-          <w:iCs/>
-          <w:highlight w:val="white"/>
-        </w:rPr>
-        <w:t xml:space="preserve">On présentera le travail grâce à une interface parlante pour le client final (ici OpenClassrooms) probablement sur </w:t>
-      </w:r>
       <w:proofErr w:type="spellStart"/>
-      <w:r>
-        <w:rPr>
-          <w:rFonts w:ascii="Inter" w:eastAsia="Inter" w:hAnsi="Inter" w:cs="Inter"/>
-          <w:iCs/>
-          <w:highlight w:val="white"/>
-        </w:rPr>
-        <w:t>streamlite</w:t>
+      <w:proofErr w:type="gramStart"/>
+      <w:r>
+        <w:rPr>
+          <w:rFonts w:ascii="Georgia" w:eastAsia="Inter" w:hAnsi="Georgia" w:cs="Inter"/>
+          <w:b/>
+          <w:lang w:val="fr-FR"/>
+        </w:rPr>
+        <w:t>dashboard</w:t>
       </w:r>
       <w:proofErr w:type="spellEnd"/>
-      <w:r>
-        <w:rPr>
-          <w:rFonts w:ascii="Inter" w:eastAsia="Inter" w:hAnsi="Inter" w:cs="Inter"/>
-          <w:iCs/>
-          <w:highlight w:val="white"/>
-        </w:rPr>
-        <w:t>.</w:t>
-      </w:r>
-      <w:r>
-        <w:rPr>
-          <w:rFonts w:ascii="Inter" w:eastAsia="Inter" w:hAnsi="Inter" w:cs="Inter"/>
-          <w:iCs/>
-          <w:highlight w:val="white"/>
+      <w:proofErr w:type="gramEnd"/>
+      <w:r>
+        <w:rPr>
+          <w:rFonts w:ascii="Georgia" w:eastAsia="Inter" w:hAnsi="Georgia" w:cs="Inter"/>
+          <w:b/>
+          <w:lang w:val="fr-FR"/>
         </w:rPr>
         <w:t xml:space="preserve"> </w:t>
       </w:r>
-    </w:p>
-    <w:p>
-      <w:pPr>
-        <w:shd w:val="clear" w:color="auto" w:fill="FFFFFF"/>
-        <w:spacing w:before="240" w:after="240"/>
-        <w:rPr>
-          <w:rFonts w:ascii="Inter" w:eastAsia="Inter" w:hAnsi="Inter" w:cs="Inter"/>
-          <w:color w:val="271A38"/>
-          <w:sz w:val="24"/>
-          <w:szCs w:val="24"/>
-          <w:shd w:val="clear" w:color="auto" w:fill="C9DAF8"/>
-        </w:rPr>
-      </w:pPr>
-      <w:r>
-        <w:rPr>
-          <w:rFonts w:ascii="Inter" w:eastAsia="Inter" w:hAnsi="Inter" w:cs="Inter"/>
-          <w:color w:val="271A38"/>
-          <w:sz w:val="24"/>
-          <w:szCs w:val="24"/>
-          <w:shd w:val="clear" w:color="auto" w:fill="C9DAF8"/>
-        </w:rPr>
-        <w:t xml:space="preserve">Autres modèles à tester : </w:t>
-      </w:r>
-    </w:p>
-    <w:p>
-      <w:pPr>
-        <w:shd w:val="clear" w:color="auto" w:fill="FFFFFF"/>
-        <w:spacing w:before="240" w:after="240"/>
-        <w:rPr>
-          <w:rFonts w:ascii="Inter" w:eastAsia="Inter" w:hAnsi="Inter" w:cs="Inter"/>
-          <w:b/>
-          <w:bCs/>
-          <w:iCs/>
-          <w:highlight w:val="white"/>
-        </w:rPr>
-      </w:pPr>
-      <w:r>
-        <w:rPr>
-          <w:rFonts w:ascii="Inter" w:eastAsia="Inter" w:hAnsi="Inter" w:cs="Inter"/>
-          <w:b/>
-          <w:bCs/>
-          <w:iCs/>
-          <w:highlight w:val="white"/>
-        </w:rPr>
-        <w:t xml:space="preserve">VIT TRANSFORMER </w:t>
+      <w:proofErr w:type="spellStart"/>
+      <w:r>
+        <w:rPr>
+          <w:rFonts w:ascii="Georgia" w:eastAsia="Inter" w:hAnsi="Georgia" w:cs="Inter"/>
+          <w:b/>
+          <w:lang w:val="fr-FR"/>
+        </w:rPr>
+        <w:t>Streamlit</w:t>
+      </w:r>
+      <w:proofErr w:type="spellEnd"/>
+      <w:r>
+        <w:rPr>
+          <w:rFonts w:ascii="Georgia" w:eastAsia="Inter" w:hAnsi="Georgia" w:cs="Inter"/>
+          <w:b/>
+          <w:lang w:val="fr-FR"/>
+        </w:rPr>
+        <w:t>, offrant ainsi au client final une comparaison transparente et documentée pour guider le choix du modèle à mettre en production.</w:t>
       </w:r>
     </w:p>
     <w:sectPr>

</xml_diff>